<commit_message>
Update manual with note on custom firmware vs UNESCO, simplify README
</commit_message>
<xml_diff>
--- a/doc/Manual_ArduND.docx
+++ b/doc/Manual_ArduND.docx
@@ -1179,7 +1179,7 @@
         <w:jc w:val="both"/>
       </w:pPr>
       <w:r>
-        <w:t>ArduNDは、ハイデンハイン社製の１軸用表示カウンターND200シリーズ(以下ND2xx)のデータ転送用シリアルポートと接続して、TCP/IP経由で現在値を取得するためのシリアル-イーサネット変換アダプタである。本機のハードウェアには、標準シリアル-イーサネット変換ボード「ETH-574」を採用している。ArduND本体のIPアドレス等はPCとUSBケーブルで接続してシリアル通信にて設定する。</w:t>
+        <w:t>ArduNDは、ハイデンハイン社製の１軸用表示カウンターND200シリーズ(以下ND2xx)のデータ転送用シリアルポートと接続して、TCP/IP経由で現在値を取得するためのシリアル-イーサネット変換アダプタである。本機のハードウェアには標準シリアル-イーサネット変換ボード「ETH-574」を採用し、専用ファームウェアを搭載している。そのため、ETH-574の汎用ファームウェア「UNESCO」とは初期設定方法や通信仕様等が異なる点に注意すること。ArduND本体のIPアドレス等はPCとUSBケーブルで接続してシリアル通信にて設定する。</w:t>
       </w:r>
     </w:p>
     <w:p/>
@@ -4448,7 +4448,7 @@
     </w:p>
     <w:p>
       <w:r>
-        <w:t>2026-10-01：版1.1作成（ハードウェア仕様としてETH-574の採用を明記）</w:t>
+        <w:t>2026-10-01：版1.1作成（ハードウェア仕様としてETH-574の採用および専用ファームウェアである旨を明記）</w:t>
         <w:br/>
         <w:t>2022-11-10：版1.0作成</w:t>
       </w:r>

</xml_diff>